<commit_message>
Add the team members and register numbers to the report
The title page, bonafide certificate and declaration now list all three
team members with their register numbers in the template's format, and
the declaration uses "We". Each name stays on the same line as its
register number, so the justified declaration has no wide gaps.

Co-Authored-By: Claude Opus 5.5 <noreply@anthropic.com>
Claude-Session: https://claude.ai/code/session_013xLmsSYhg22wZYVafJsuet
</commit_message>
<xml_diff>
--- a/docs/report/Poise_Mini_Project_Report.docx
+++ b/docs/report/Poise_Mini_Project_Report.docx
@@ -116,6 +116,54 @@
     </w:p>
     <w:p>
       <w:pPr>
+        <w:spacing w:line="240" w:lineRule="auto"/>
+        <w:jc w:val="center"/>
+        <w:rPr>
+          <w:rFonts w:ascii="Times New Roman" w:cs="Times New Roman" w:eastAsia="Times New Roman" w:hAnsi="Times New Roman"/>
+          <w:b w:val="1"/>
+          <w:bCs w:val="1"/>
+          <w:sz w:val="28"/>
+          <w:szCs w:val="28"/>
+        </w:rPr>
+      </w:pPr>
+      <w:r>
+        <w:rPr>
+          <w:rFonts w:ascii="Times New Roman" w:cs="Times New Roman" w:eastAsia="Times New Roman" w:hAnsi="Times New Roman"/>
+          <w:b w:val="1"/>
+          <w:bCs w:val="1"/>
+          <w:sz w:val="28"/>
+          <w:szCs w:val="28"/>
+          <w:rtl w:val="0"/>
+        </w:rPr>
+        <w:t xml:space="preserve">KA Dharan Balaji [RA2411003020260]</w:t>
+      </w:r>
+    </w:p>
+    <w:p>
+      <w:pPr>
+        <w:spacing w:line="240" w:lineRule="auto"/>
+        <w:jc w:val="center"/>
+        <w:rPr>
+          <w:rFonts w:ascii="Times New Roman" w:cs="Times New Roman" w:eastAsia="Times New Roman" w:hAnsi="Times New Roman"/>
+          <w:b w:val="1"/>
+          <w:bCs w:val="1"/>
+          <w:sz w:val="28"/>
+          <w:szCs w:val="28"/>
+        </w:rPr>
+      </w:pPr>
+      <w:r>
+        <w:rPr>
+          <w:rFonts w:ascii="Times New Roman" w:cs="Times New Roman" w:eastAsia="Times New Roman" w:hAnsi="Times New Roman"/>
+          <w:b w:val="1"/>
+          <w:bCs w:val="1"/>
+          <w:sz w:val="28"/>
+          <w:szCs w:val="28"/>
+          <w:rtl w:val="0"/>
+        </w:rPr>
+        <w:t xml:space="preserve">Abishek V.P.T [RA2411003020266]</w:t>
+      </w:r>
+    </w:p>
+    <w:p>
+      <w:pPr>
         <w:spacing w:line="360" w:lineRule="auto"/>
         <w:jc w:val="center"/>
         <w:rPr>
@@ -135,7 +183,7 @@
           <w:szCs w:val="28"/>
           <w:rtl w:val="0"/>
         </w:rPr>
-        <w:t xml:space="preserve">Varadharajan V</w:t>
+        <w:t xml:space="preserve">V Varadharajan [RA2411003020267]</w:t>
       </w:r>
     </w:p>
     <w:p>
@@ -638,15 +686,15 @@
           <w:sz w:val="28"/>
           <w:szCs w:val="28"/>
         </w:rPr>
-        <w:t xml:space="preserve">VARADHARAJAN V</w:t>
-      </w:r>
-      <w:r>
-        <w:rPr>
-          <w:rFonts w:ascii="Times New Roman" w:cs="Times New Roman" w:eastAsia="Times New Roman" w:hAnsi="Times New Roman"/>
-          <w:sz w:val="28"/>
-          <w:szCs w:val="28"/>
-        </w:rPr>
-        <w:t xml:space="preserve">, student of </w:t>
+        <w:t xml:space="preserve">KA DHARAN BALAJI (RA2411003020260), ABISHEK V.P.T (RA2411003020266), and V VARADHARAJAN (RA2411003020267)</w:t>
+      </w:r>
+      <w:r>
+        <w:rPr>
+          <w:rFonts w:ascii="Times New Roman" w:cs="Times New Roman" w:eastAsia="Times New Roman" w:hAnsi="Times New Roman"/>
+          <w:sz w:val="28"/>
+          <w:szCs w:val="28"/>
+        </w:rPr>
+        <w:t xml:space="preserve">, students of </w:t>
       </w:r>
       <w:r>
         <w:rPr>
@@ -1274,7 +1322,7 @@
           <w:sz w:val="28"/>
           <w:szCs w:val="28"/>
         </w:rPr>
-        <w:t xml:space="preserve">I hereby declare that the entire work contained in this mini project report titled </w:t>
+        <w:t xml:space="preserve">We hereby declare that the entire work contained in this mini project report titled </w:t>
       </w:r>
       <w:r>
         <w:rPr>
@@ -1302,7 +1350,7 @@
           <w:sz w:val="28"/>
           <w:szCs w:val="28"/>
         </w:rPr>
-        <w:t xml:space="preserve">VARADHARAJAN V</w:t>
+        <w:t xml:space="preserve">KA DHARAN BALAJI [RA2411003020260], ABISHEK V.P.T [RA2411003020266], and V VARADHARAJAN [RA2411003020267]</w:t>
       </w:r>
       <w:r>
         <w:rPr>

</xml_diff>